<commit_message>
doc: update markdown documents with new PhoBERT performance metrics
</commit_message>
<xml_diff>
--- a/BCKL_KsorPhuk.docx
+++ b/BCKL_KsorPhuk.docx
@@ -26360,22 +26360,8 @@
             </w:tcMar>
           </w:tcPr>
           <w:p>
-            <w:pPr>
-              <w:spacing w:line="276" w:lineRule="auto" w:after="40"/>
-            </w:pPr>
-            <w:r>
-              <w:rPr>
-                <w:rFonts w:ascii="Times New Roman" w:hAnsi="Times New Roman"/>
-                <w:sz w:val="22"/>
-              </w:rPr>
-            </w:r>
-            <w:r>
-              <w:rPr>
-                <w:rFonts w:ascii="Times New Roman" w:hAnsi="Times New Roman"/>
-                <w:b/>
-                <w:sz w:val="22"/>
-              </w:rPr>
-              <w:t>97.37%</w:t>
+            <w:r>
+              <w:t>97.08%</w:t>
             </w:r>
           </w:p>
         </w:tc>
@@ -26390,22 +26376,8 @@
             </w:tcMar>
           </w:tcPr>
           <w:p>
-            <w:pPr>
-              <w:spacing w:line="276" w:lineRule="auto" w:after="40"/>
-            </w:pPr>
-            <w:r>
-              <w:rPr>
-                <w:rFonts w:ascii="Times New Roman" w:hAnsi="Times New Roman"/>
-                <w:sz w:val="22"/>
-              </w:rPr>
-            </w:r>
-            <w:r>
-              <w:rPr>
-                <w:rFonts w:ascii="Times New Roman" w:hAnsi="Times New Roman"/>
-                <w:b/>
-                <w:sz w:val="22"/>
-              </w:rPr>
-              <w:t>97.51%</w:t>
+            <w:r>
+              <w:t>97.34%</w:t>
             </w:r>
           </w:p>
         </w:tc>
@@ -26420,22 +26392,8 @@
             </w:tcMar>
           </w:tcPr>
           <w:p>
-            <w:pPr>
-              <w:spacing w:line="276" w:lineRule="auto" w:after="40"/>
-            </w:pPr>
-            <w:r>
-              <w:rPr>
-                <w:rFonts w:ascii="Times New Roman" w:hAnsi="Times New Roman"/>
-                <w:sz w:val="22"/>
-              </w:rPr>
-            </w:r>
-            <w:r>
-              <w:rPr>
-                <w:rFonts w:ascii="Times New Roman" w:hAnsi="Times New Roman"/>
-                <w:b/>
-                <w:sz w:val="22"/>
-              </w:rPr>
-              <w:t>0.0125</w:t>
+            <w:r>
+              <w:t>0.0139</w:t>
             </w:r>
           </w:p>
         </w:tc>
@@ -26450,22 +26408,8 @@
             </w:tcMar>
           </w:tcPr>
           <w:p>
-            <w:pPr>
-              <w:spacing w:line="276" w:lineRule="auto" w:after="40"/>
-            </w:pPr>
-            <w:r>
-              <w:rPr>
-                <w:rFonts w:ascii="Times New Roman" w:hAnsi="Times New Roman"/>
-                <w:sz w:val="22"/>
-              </w:rPr>
-            </w:r>
-            <w:r>
-              <w:rPr>
-                <w:rFonts w:ascii="Times New Roman" w:hAnsi="Times New Roman"/>
-                <w:b/>
-                <w:sz w:val="22"/>
-              </w:rPr>
-              <w:t>73.47%</w:t>
+            <w:r>
+              <w:t>74.93%</w:t>
             </w:r>
           </w:p>
         </w:tc>
@@ -26480,22 +26424,8 @@
             </w:tcMar>
           </w:tcPr>
           <w:p>
-            <w:pPr>
-              <w:spacing w:line="276" w:lineRule="auto" w:after="40"/>
-            </w:pPr>
-            <w:r>
-              <w:rPr>
-                <w:rFonts w:ascii="Times New Roman" w:hAnsi="Times New Roman"/>
-                <w:sz w:val="22"/>
-              </w:rPr>
-            </w:r>
-            <w:r>
-              <w:rPr>
-                <w:rFonts w:ascii="Times New Roman" w:hAnsi="Times New Roman"/>
-                <w:b/>
-                <w:sz w:val="22"/>
-              </w:rPr>
-              <w:t>73.65%</w:t>
+            <w:r>
+              <w:t>76.01%</w:t>
             </w:r>
           </w:p>
         </w:tc>
@@ -27890,71 +27820,7 @@
         <w:jc w:val="both"/>
       </w:pPr>
       <w:r>
-        <w:rPr>
-          <w:rFonts w:ascii="Times New Roman" w:hAnsi="Times New Roman"/>
-          <w:sz w:val="26"/>
-        </w:rPr>
-        <w:t xml:space="preserve">Khi quy mô tập dữ liệu huấn luyện được mở rộng lên </w:t>
-      </w:r>
-      <w:r>
-        <w:rPr>
-          <w:rFonts w:ascii="Times New Roman" w:hAnsi="Times New Roman"/>
-          <w:b/>
-          <w:sz w:val="26"/>
-        </w:rPr>
-        <w:t>70% dữ liệu gốc (tương đương 909.913 dòng)</w:t>
-      </w:r>
-      <w:r>
-        <w:rPr>
-          <w:rFonts w:ascii="Times New Roman" w:hAnsi="Times New Roman"/>
-          <w:sz w:val="26"/>
-        </w:rPr>
-        <w:t xml:space="preserve">, PhoBERT đã phát huy tối đa sức mạnh của kiến trúc Transformer pre-trained sâu sắc, đạt mức bứt phá hiệu năng vượt bậc với F1-micro đạt </w:t>
-      </w:r>
-      <w:r>
-        <w:rPr>
-          <w:rFonts w:ascii="Times New Roman" w:hAnsi="Times New Roman"/>
-          <w:b/>
-          <w:sz w:val="26"/>
-        </w:rPr>
-        <w:t>97.37%</w:t>
-      </w:r>
-      <w:r>
-        <w:rPr>
-          <w:rFonts w:ascii="Times New Roman" w:hAnsi="Times New Roman"/>
-          <w:sz w:val="26"/>
-        </w:rPr>
-        <w:t xml:space="preserve"> và F1-macro đạt </w:t>
-      </w:r>
-      <w:r>
-        <w:rPr>
-          <w:rFonts w:ascii="Times New Roman" w:hAnsi="Times New Roman"/>
-          <w:b/>
-          <w:sz w:val="26"/>
-        </w:rPr>
-        <w:t>97.51%</w:t>
-      </w:r>
-      <w:r>
-        <w:rPr>
-          <w:rFonts w:ascii="Times New Roman" w:hAnsi="Times New Roman"/>
-          <w:sz w:val="26"/>
-        </w:rPr>
-        <w:t xml:space="preserve">, đồng thời kéo tỷ lệ lỗi Hamming Loss xuống mức cực thấp là </w:t>
-      </w:r>
-      <w:r>
-        <w:rPr>
-          <w:rFonts w:ascii="Times New Roman" w:hAnsi="Times New Roman"/>
-          <w:b/>
-          <w:sz w:val="26"/>
-        </w:rPr>
-        <w:t>0.0125</w:t>
-      </w:r>
-      <w:r>
-        <w:rPr>
-          <w:rFonts w:ascii="Times New Roman" w:hAnsi="Times New Roman"/>
-          <w:sz w:val="26"/>
-        </w:rPr>
-        <w:t>. Điều này chứng minh tính đúng đắn của chiến lược tăng quy mô dữ liệu (Data Scaling) đối với các mô hình học máy hiện đại.</w:t>
+        <w:t>Khi quy mô tập dữ liệu huấn luyện được mở rộng lên 70% dữ liệu gốc (tương đương 909.913 dòng), PhoBERT đã phát huy tối đa sức mạnh của kiến trúc Transformer pre-trained sâu sắc, đạt mức bứt phá hiệu năng vượt bậc với F1-micro đạt 97.08% và F1-macro đạt 97.34%, đồng thời kéo tỷ lệ lỗi Hamming Loss xuống mức cực thấp là 0.0139. Điều này chứng minh tính đúng đắn của chiến lược tăng quy mô dữ liệu (Data Scaling) đối với các mô hình học máy hiện đại.</w:t>
       </w:r>
     </w:p>
     <w:p>
@@ -28073,42 +27939,7 @@
         <w:ind w:left="360"/>
       </w:pPr>
       <w:r>
-        <w:rPr>
-          <w:rFonts w:ascii="Times New Roman" w:hAnsi="Times New Roman"/>
-          <w:b/>
-          <w:sz w:val="26"/>
-        </w:rPr>
-        <w:t xml:space="preserve">2. </w:t>
-      </w:r>
-      <w:r>
-        <w:rPr>
-          <w:rFonts w:ascii="Times New Roman" w:hAnsi="Times New Roman"/>
-          <w:b/>
-          <w:sz w:val="26"/>
-        </w:rPr>
-        <w:t>Tối ưu hóa hiệu năng tính toán:</w:t>
-      </w:r>
-      <w:r>
-        <w:rPr>
-          <w:rFonts w:ascii="Times New Roman" w:hAnsi="Times New Roman"/>
-          <w:sz w:val="26"/>
-        </w:rPr>
-        <w:t xml:space="preserve"> Giảm thiểu thời gian suy luận đi một nửa so với việc sử dụng hai mô hình tuần tự độc lập, đồng thời ngăn chặn sai số tích lũy (error propagation) từ bước nhận diện khía cạnh sang bước phân loại cảm xúc. Mô hình đạt độ chính xác cảm xúc tổng thể rất ấn tượng là </w:t>
-      </w:r>
-      <w:r>
-        <w:rPr>
-          <w:rFonts w:ascii="Times New Roman" w:hAnsi="Times New Roman"/>
-          <w:b/>
-          <w:sz w:val="26"/>
-        </w:rPr>
-        <w:t>73.65% Accuracy</w:t>
-      </w:r>
-      <w:r>
-        <w:rPr>
-          <w:rFonts w:ascii="Times New Roman" w:hAnsi="Times New Roman"/>
-          <w:sz w:val="26"/>
-        </w:rPr>
-        <w:t xml:space="preserve"> trên tập dữ liệu lệch lớp thực tế.</w:t>
+        <w:t>2. Tối ưu hóa hiệu năng tính toán: Giảm thiểu thời gian suy luận đi một nửa so với việc sử dụng hai mô hình tuần tự độc lập, đồng thời ngăn chặn sai số tích lũy (error propagation) từ bước nhận diện khía cạnh sang bước phân loại cảm xúc. Mô hình đạt độ chính xác cảm xúc tổng thể rất ấn tượng là 76.01% Accuracy trên tập dữ liệu lệch lớp thực tế.</w:t>
       </w:r>
     </w:p>
     <w:p>
@@ -29351,44 +29182,8 @@
             </w:tcMar>
           </w:tcPr>
           <w:p>
-            <w:pPr>
-              <w:spacing w:line="276" w:lineRule="auto" w:after="40"/>
-            </w:pPr>
-            <w:r>
-              <w:rPr>
-                <w:rFonts w:ascii="Times New Roman" w:hAnsi="Times New Roman"/>
-                <w:sz w:val="22"/>
-              </w:rPr>
-            </w:r>
-            <w:r>
-              <w:rPr>
-                <w:rFonts w:ascii="Times New Roman" w:hAnsi="Times New Roman"/>
-                <w:sz w:val="22"/>
-              </w:rPr>
-              <w:t xml:space="preserve">PhoBERT Multi-task đạt </w:t>
-            </w:r>
-            <w:r>
-              <w:rPr>
-                <w:rFonts w:ascii="Times New Roman" w:hAnsi="Times New Roman"/>
-                <w:b/>
-                <w:sz w:val="22"/>
-              </w:rPr>
-              <w:t>Aspect F1-micro 97.37%</w:t>
-            </w:r>
-            <w:r>
-              <w:rPr>
-                <w:rFonts w:ascii="Times New Roman" w:hAnsi="Times New Roman"/>
-                <w:sz w:val="22"/>
-              </w:rPr>
-              <w:t xml:space="preserve"> và </w:t>
-            </w:r>
-            <w:r>
-              <w:rPr>
-                <w:rFonts w:ascii="Times New Roman" w:hAnsi="Times New Roman"/>
-                <w:b/>
-                <w:sz w:val="22"/>
-              </w:rPr>
-              <w:t>Sentiment Accuracy 73.65%</w:t>
+            <w:r>
+              <w:t>PhoBERT Multi-task đạt Aspect F1-micro 97.08% và Sentiment Accuracy 76.01%</w:t>
             </w:r>
           </w:p>
         </w:tc>
@@ -32800,131 +32595,7 @@
         <w:ind w:left="360"/>
       </w:pPr>
       <w:r>
-        <w:rPr>
-          <w:rFonts w:ascii="Times New Roman" w:hAnsi="Times New Roman"/>
-          <w:sz w:val="26"/>
-        </w:rPr>
-        <w:t xml:space="preserve">- </w:t>
-      </w:r>
-      <w:r>
-        <w:rPr>
-          <w:rFonts w:ascii="Times New Roman" w:hAnsi="Times New Roman"/>
-          <w:b/>
-          <w:sz w:val="26"/>
-        </w:rPr>
-        <w:t>Về mặt Thực nghiệm và Mô hình hóa:</w:t>
-      </w:r>
-      <w:r>
-        <w:rPr>
-          <w:rFonts w:ascii="Times New Roman" w:hAnsi="Times New Roman"/>
-          <w:sz w:val="26"/>
-        </w:rPr>
-        <w:t xml:space="preserve"> Lập trình và huấn luyện thành công các mô hình ABSA. Qua quá trình đối sánh hiệu năng khách quan trên tập Gold Eval gồm 721 dòng, mô hình </w:t>
-      </w:r>
-      <w:r>
-        <w:rPr>
-          <w:rFonts w:ascii="Times New Roman" w:hAnsi="Times New Roman"/>
-          <w:b/>
-          <w:sz w:val="26"/>
-        </w:rPr>
-        <w:t>PhoBERT Multi-task</w:t>
-      </w:r>
-      <w:r>
-        <w:rPr>
-          <w:rFonts w:ascii="Times New Roman" w:hAnsi="Times New Roman"/>
-          <w:sz w:val="26"/>
-        </w:rPr>
-        <w:t xml:space="preserve"> đã chứng minh sự vượt trội hoàn toàn với </w:t>
-      </w:r>
-      <w:r>
-        <w:rPr>
-          <w:rFonts w:ascii="Times New Roman" w:hAnsi="Times New Roman"/>
-          <w:b/>
-          <w:sz w:val="26"/>
-        </w:rPr>
-        <w:t>Aspect F1-micro đạt 97.37%</w:t>
-      </w:r>
-      <w:r>
-        <w:rPr>
-          <w:rFonts w:ascii="Times New Roman" w:hAnsi="Times New Roman"/>
-          <w:sz w:val="26"/>
-        </w:rPr>
-        <w:t xml:space="preserve">, </w:t>
-      </w:r>
-      <w:r>
-        <w:rPr>
-          <w:rFonts w:ascii="Times New Roman" w:hAnsi="Times New Roman"/>
-          <w:b/>
-          <w:sz w:val="26"/>
-        </w:rPr>
-        <w:t>F1-macro đạt 97.51%</w:t>
-      </w:r>
-      <w:r>
-        <w:rPr>
-          <w:rFonts w:ascii="Times New Roman" w:hAnsi="Times New Roman"/>
-          <w:sz w:val="26"/>
-        </w:rPr>
-        <w:t xml:space="preserve"> và </w:t>
-      </w:r>
-      <w:r>
-        <w:rPr>
-          <w:rFonts w:ascii="Times New Roman" w:hAnsi="Times New Roman"/>
-          <w:b/>
-          <w:sz w:val="26"/>
-        </w:rPr>
-        <w:t>Hamming Loss đạt 0.0125</w:t>
-      </w:r>
-      <w:r>
-        <w:rPr>
-          <w:rFonts w:ascii="Times New Roman" w:hAnsi="Times New Roman"/>
-          <w:sz w:val="26"/>
-        </w:rPr>
-        <w:t xml:space="preserve">, vượt xa mô hình Baseline SVM (F1-micro 85.25%) và Bi-LSTM (F1-micro 74.87%). Đồng thời, mô hình đa nhiệm cũng giải quyết hiệu quả tác vụ phân loại cảm xúc khía cạnh đạt </w:t>
-      </w:r>
-      <w:r>
-        <w:rPr>
-          <w:rFonts w:ascii="Times New Roman" w:hAnsi="Times New Roman"/>
-          <w:b/>
-          <w:sz w:val="26"/>
-        </w:rPr>
-        <w:t>73.65% Accuracy</w:t>
-      </w:r>
-      <w:r>
-        <w:rPr>
-          <w:rFonts w:ascii="Times New Roman" w:hAnsi="Times New Roman"/>
-          <w:sz w:val="26"/>
-        </w:rPr>
-        <w:t xml:space="preserve">. Đề tài đã đề xuất và thực nghiệm thành công kỹ thuật </w:t>
-      </w:r>
-      <w:r>
-        <w:rPr>
-          <w:rFonts w:ascii="Times New Roman" w:hAnsi="Times New Roman"/>
-          <w:b/>
-          <w:sz w:val="26"/>
-        </w:rPr>
-        <w:t>Pre-tokenization</w:t>
-      </w:r>
-      <w:r>
-        <w:rPr>
-          <w:rFonts w:ascii="Times New Roman" w:hAnsi="Times New Roman"/>
-          <w:sz w:val="26"/>
-        </w:rPr>
-        <w:t xml:space="preserve"> trên GPU T4 x2, giúp tối ưu hóa 100% tài nguyên tính toán và hoàn thành huấn luyện chỉ trong </w:t>
-      </w:r>
-      <w:r>
-        <w:rPr>
-          <w:rFonts w:ascii="Times New Roman" w:hAnsi="Times New Roman"/>
-          <w:b/>
-          <w:sz w:val="26"/>
-        </w:rPr>
-        <w:t>25 phút</w:t>
-      </w:r>
-      <w:r>
-        <w:rPr>
-          <w:rFonts w:ascii="Times New Roman" w:hAnsi="Times New Roman"/>
-          <w:sz w:val="26"/>
-        </w:rPr>
-        <w:t>.</w:t>
+        <w:t>- Về mặt Thực nghiệm và Mô hình hóa: Lập trình và huấn luyện thành công các mô hình ABSA. Qua quá trình đối sánh hiệu năng khách quan trên tập Gold Eval gồm 721 dòng, mô hình PhoBERT Multi-task đã chứng minh sự vượt trội hoàn toàn với Aspect F1-micro đạt 97.08%, F1-macro đạt 97.34% và Hamming Loss đạt 0.0139, vượt xa mô hình Baseline SVM (F1-micro 85.25%) và Bi-LSTM (F1-micro 74.87%). Đồng thời, mô hình đa nhiệm cũng giải quyết hiệu quả tác vụ phân loại cảm xúc khía cạnh đạt 76.01% Accuracy. Đề tài đã đề xuất và thực nghiệm thành công kỹ thuật Pre-tokenization trên GPU T4 x2, giúp tối ưu hóa 100% tài nguyên tính toán và hoàn thành huấn luyện chỉ trong 25 phút.</w:t>
       </w:r>
     </w:p>
     <w:p>
@@ -33118,27 +32789,7 @@
         <w:ind w:left="360"/>
       </w:pPr>
       <w:r>
-        <w:rPr>
-          <w:rFonts w:ascii="Times New Roman" w:hAnsi="Times New Roman"/>
-          <w:b/>
-          <w:sz w:val="26"/>
-        </w:rPr>
-        <w:t xml:space="preserve">2. </w:t>
-      </w:r>
-      <w:r>
-        <w:rPr>
-          <w:rFonts w:ascii="Times New Roman" w:hAnsi="Times New Roman"/>
-          <w:b/>
-          <w:sz w:val="26"/>
-        </w:rPr>
-        <w:t>Thách thức xử lý sắc thái châm biếm (Sarcasm) và ẩn ý ngược nghĩa:</w:t>
-      </w:r>
-      <w:r>
-        <w:rPr>
-          <w:rFonts w:ascii="Times New Roman" w:hAnsi="Times New Roman"/>
-          <w:sz w:val="26"/>
-        </w:rPr>
-        <w:t xml:space="preserve"> Độ chính xác phân loại cảm xúc khía cạnh tổng thể dừng lại ở mức 73.65% do tiếng Việt trực tuyến cực kỳ phong phú các câu văn mang sắc thái mỉa mai, ẩn ý hoặc sử dụng các từ ngữ mang tính tương phản cao.</w:t>
+        <w:t>2. Thách thức xử lý sắc thái châm biếm (Sarcasm) và ẩn ý ngược nghĩa: Độ chính xác phân loại cảm xúc khía cạnh tổng thể dừng lại ở mức 76.01% do tiếng Việt trực tuyến cực kỳ phong phú các câu văn mang sắc thái mỉa mai, ẩn ý hoặc sử dụng các từ ngữ mang tính tương phản cao.</w:t>
       </w:r>
     </w:p>
     <w:p>

</xml_diff>

<commit_message>
doc: correct Ho et al. (2023) citation in bibliography of main report docx
</commit_message>
<xml_diff>
--- a/BCKL_KsorPhuk.docx
+++ b/BCKL_KsorPhuk.docx
@@ -54689,46 +54689,7 @@
         </w:rPr>
       </w:pPr>
       <w:r>
-        <w:rPr>
-          <w:b/>
-          <w:lang w:val="vi-VN"/>
-        </w:rPr>
-        <w:t xml:space="preserve">3. </w:t>
-      </w:r>
-      <w:r>
-        <w:rPr>
-          <w:lang w:val="vi-VN"/>
-        </w:rPr>
-        <w:t xml:space="preserve">Ho, T. T., Bui, H. M., and Thai, P. K. (2021). "A Hybrid Approach for Aspect-Based Sentiment Analysis in Mobile Commerce." </w:t>
-      </w:r>
-      <w:r>
-        <w:rPr>
-          <w:i/>
-          <w:lang w:val="vi-VN"/>
-        </w:rPr>
-        <w:t>International Journal of Artificial Intelligence</w:t>
-      </w:r>
-      <w:r>
-        <w:rPr>
-          <w:lang w:val="vi-VN"/>
-        </w:rPr>
-        <w:t xml:space="preserve">, Vol. 8, No. 2, pp. 976-988. Available: </w:t>
-      </w:r>
-      <w:hyperlink r:id="rId29">
-        <w:r>
-          <w:rPr>
-            <w:color w:val="0000FF"/>
-            <w:u w:val="single"/>
-            <w:lang w:val="vi-VN"/>
-          </w:rPr>
-          <w:t>https://www.ijain.org/index.php/IJAIN/article/view/976</w:t>
-        </w:r>
-      </w:hyperlink>
-      <w:r>
-        <w:rPr>
-          <w:lang w:val="vi-VN"/>
-        </w:rPr>
-        <w:t>.</w:t>
+        <w:t>3. Ho, T. T., Bui, H. M., and Thai, P. K. (2023). "A hybrid model for aspect-based sentiment analysis on customer feedback: research on the mobile commerce sector in Vietnam." International Journal of Advances in Intelligent Informatics, Vol. 9, No. 2, pp. 248-261. DOI: https://doi.org/10.26555/ijain.v9i2.976.</w:t>
       </w:r>
     </w:p>
     <w:p>

</xml_diff>

<commit_message>
doc: update VECOM 2024 statistics to EBI 2025 (27% growth, 32B USD) in main report and markdown
</commit_message>
<xml_diff>
--- a/BCKL_KsorPhuk.docx
+++ b/BCKL_KsorPhuk.docx
@@ -18808,10 +18808,7 @@
         </w:rPr>
       </w:pPr>
       <w:r>
-        <w:rPr>
-          <w:lang w:val="vi-VN"/>
-        </w:rPr>
-        <w:t>Trong những năm gần đây, sự bùng nổ của mạng lưới Internet toàn cầu, các thiết bị di động thông minh và sự phát triển vượt bậc của hạ tầng thanh toán số đã thúc đẩy nền kinh tế số Việt Nam phát triển với tốc độ vô cùng nhanh chóng. Trong xu thế đó, thương mại điện tử (TMĐT) đã khẳng định vị thế là một trong những động lực tăng trưởng cốt lõi của nền kinh tế. Theo số liệu thống kê chính thức từ Báo cáo Chỉ số Thương mại điện tử Việt Nam (EBI) do Hiệp hội Thương mại điện tử Việt Nam (VECOM) công bố, tốc độ tăng trưởng của TMĐT Việt Nam năm 2023 đạt khoảng 25%, với quy mô thị trường bán lẻ trực tuyến chạm mốc 25 tỷ USD, đưa Việt Nam trở thành một trong những quốc gia có tốc độ phát triển TMĐT nhanh nhất khu vực Đông Nam Á. Sự cạnh tranh khốc liệt giữa các đại siêu thị trực tuyến như Shopee, Lazada, TikTok Shop, Tiki và các website bán lẻ độc lập đã làm thay đổi hoàn toàn thói quen mua sắm của người tiêu dùng. Giờ đây, thay vì chỉ tiếp cận sản phẩm qua quảng cáo một chiều từ doanh nghiệp, khách hàng có xu hướng dựa vào các đánh giá, phản hồi thực tế của những người mua trước làm căn cứ đưa ra quyết định tiêu dùng. Nguồn thông tin phản hồi phi cấu trúc khổng lồ này được gọi chung là truyền miệng điện tử trực tuyến (electronic Word-of-Mouth - eWOM).</w:t>
+        <w:t>Trong những năm gần đây, sự bùng nổ của mạng lưới Internet toàn cầu, các thiết bị di động thông minh và sự phát triển vượt bậc của hạ tầng thanh toán số đã thúc đẩy nền kinh tế số Việt Nam phát triển với tốc độ vô cùng nhanh chóng. Trong xu thế đó, thương mại điện tử (TMĐT) đã khẳng định vị thế là một trong những động lực tăng trưởng cốt lõi của nền kinh tế. Theo số liệu thống kê chính thức từ Báo cáo Chỉ số Thương mại điện tử Việt Nam (EBI) do Hiệp hội Thương mại điện tử Việt Nam (VECOM) công bố, tốc độ tăng trưởng của TMĐT Việt Nam năm 2024 đạt khoảng 27%, với quy mô thị trường bán lẻ trực tuyến đạt mốc 32 tỷ USD, đưa Việt Nam trở thành một trong những quốc gia có tốc độ phát triển TMĐT nhanh nhất khu vực Đông Nam Á. Sự cạnh tranh khốc liệt giữa các đại siêu thị trực tuyến như Shopee, Lazada, TikTok Shop, Tiki và các website bán lẻ độc lập đã làm thay đổi hoàn toàn thói quen mua sắm của người tiêu dùng. Giờ đây, thay vì chỉ tiếp cận sản phẩm qua quảng cáo một chiều từ doanh nghiệp, khách hàng có xu hướng dựa vào các đánh giá, phản hồi thực tế của những người mua trước làm căn cứ đưa ra quyết định tiêu dùng. Nguồn thông tin phản hồi phi cấu trúc khổng lồ này được gọi chung là truyền miệng điện tử trực tuyến (electronic Word-of-Mouth - eWOM).</w:t>
       </w:r>
     </w:p>
     <w:p>
@@ -54569,46 +54566,7 @@
         </w:rPr>
       </w:pPr>
       <w:r>
-        <w:rPr>
-          <w:b/>
-          <w:lang w:val="vi-VN"/>
-        </w:rPr>
-        <w:t xml:space="preserve">1. </w:t>
-      </w:r>
-      <w:r>
-        <w:rPr>
-          <w:lang w:val="vi-VN"/>
-        </w:rPr>
-        <w:t xml:space="preserve">Hiệp hội Thương mại điện tử Việt Nam - VECOM (2024), </w:t>
-      </w:r>
-      <w:r>
-        <w:rPr>
-          <w:i/>
-          <w:lang w:val="vi-VN"/>
-        </w:rPr>
-        <w:t>Báo cáo Chỉ số Thương mại điện tử Việt Nam (EBI) 2024</w:t>
-      </w:r>
-      <w:r>
-        <w:rPr>
-          <w:lang w:val="vi-VN"/>
-        </w:rPr>
-        <w:t xml:space="preserve">, nguồn link trực tuyến: </w:t>
-      </w:r>
-      <w:hyperlink r:id="rId27">
-        <w:r>
-          <w:rPr>
-            <w:color w:val="0000FF"/>
-            <w:u w:val="single"/>
-            <w:lang w:val="vi-VN"/>
-          </w:rPr>
-          <w:t>https://vecom.vn/bao-cao-ebi</w:t>
-        </w:r>
-      </w:hyperlink>
-      <w:r>
-        <w:rPr>
-          <w:lang w:val="vi-VN"/>
-        </w:rPr>
-        <w:t>, ngày truy cập: 15/04/2026.</w:t>
+        <w:t>1. Hiệp hội Thương mại điện tử Việt Nam - VECOM (2025), Báo cáo Chỉ số Thương mại điện tử Việt Nam (EBI) 2025, nguồn link trực tuyến: https://vecom.vn/bao-cao-ebi, ngày truy cập: 15/04/2026.</w:t>
       </w:r>
     </w:p>
     <w:p>

</xml_diff>

<commit_message>
revert: VECOM statistics back to 2023 (25% growth, 25B USD) and EBI 2024 citation as requested by mentor
</commit_message>
<xml_diff>
--- a/BCKL_KsorPhuk.docx
+++ b/BCKL_KsorPhuk.docx
@@ -18808,7 +18808,7 @@
         </w:rPr>
       </w:pPr>
       <w:r>
-        <w:t>Trong những năm gần đây, sự bùng nổ của mạng lưới Internet toàn cầu, các thiết bị di động thông minh và sự phát triển vượt bậc của hạ tầng thanh toán số đã thúc đẩy nền kinh tế số Việt Nam phát triển với tốc độ vô cùng nhanh chóng. Trong xu thế đó, thương mại điện tử (TMĐT) đã khẳng định vị thế là một trong những động lực tăng trưởng cốt lõi của nền kinh tế. Theo số liệu thống kê chính thức từ Báo cáo Chỉ số Thương mại điện tử Việt Nam (EBI) do Hiệp hội Thương mại điện tử Việt Nam (VECOM) công bố, tốc độ tăng trưởng của TMĐT Việt Nam năm 2024 đạt khoảng 27%, với quy mô thị trường bán lẻ trực tuyến đạt mốc 32 tỷ USD, đưa Việt Nam trở thành một trong những quốc gia có tốc độ phát triển TMĐT nhanh nhất khu vực Đông Nam Á. Sự cạnh tranh khốc liệt giữa các đại siêu thị trực tuyến như Shopee, Lazada, TikTok Shop, Tiki và các website bán lẻ độc lập đã làm thay đổi hoàn toàn thói quen mua sắm của người tiêu dùng. Giờ đây, thay vì chỉ tiếp cận sản phẩm qua quảng cáo một chiều từ doanh nghiệp, khách hàng có xu hướng dựa vào các đánh giá, phản hồi thực tế của những người mua trước làm căn cứ đưa ra quyết định tiêu dùng. Nguồn thông tin phản hồi phi cấu trúc khổng lồ này được gọi chung là truyền miệng điện tử trực tuyến (electronic Word-of-Mouth - eWOM).</w:t>
+        <w:t>Trong những năm gần đây, sự bùng nổ của mạng lưới Internet toàn cầu, các thiết bị di động thông minh và sự phát triển vượt bậc của hạ tầng thanh toán số đã thúc đẩy nền kinh tế số Việt Nam phát triển với tốc độ vô cùng nhanh chóng. Trong xu thế đó, thương mại điện tử (TMĐT) đã khẳng định vị thế là một trong những động lực tăng trưởng cốt lõi của nền kinh tế. Theo số liệu thống kê chính thức từ Báo cáo Chỉ số Thương mại điện tử Việt Nam (EBI) do Hiệp hội Thương mại điện tử Việt Nam (VECOM) công bố, tốc độ tăng trưởng của TMĐT Việt Nam năm 2023 đạt khoảng 25%, với quy mô thị trường bán lẻ trực tuyến chạm mốc 25 tỷ USD, đưa Việt Nam trở thành một trong những quốc gia có tốc độ phát triển TMĐT nhanh nhất khu vực Đông Nam Á. Sự cạnh tranh khốc liệt giữa các đại siêu thị trực tuyến như Shopee, Lazada, TikTok Shop, Tiki và các website bán lẻ độc lập đã làm thay đổi hoàn toàn thói quen mua sắm của người tiêu dùng. Giờ đây, thay vì chỉ tiếp cận sản phẩm qua quảng cáo một chiều từ doanh nghiệp, khách hàng có xu hướng dựa vào các đánh giá, phản hồi thực tế của những người mua trước làm căn cứ đưa ra quyết định tiêu dùng. Nguồn thông tin phản hồi phi cấu trúc khổng lồ này được gọi chung là truyền miệng điện tử trực tuyến (electronic Word-of-Mouth - eWOM).</w:t>
       </w:r>
     </w:p>
     <w:p>
@@ -54566,7 +54566,7 @@
         </w:rPr>
       </w:pPr>
       <w:r>
-        <w:t>1. Hiệp hội Thương mại điện tử Việt Nam - VECOM (2025), Báo cáo Chỉ số Thương mại điện tử Việt Nam (EBI) 2025, nguồn link trực tuyến: https://vecom.vn/bao-cao-ebi, ngày truy cập: 15/04/2026.</w:t>
+        <w:t>1. Hiệp hội Thương mại điện tử Việt Nam - VECOM (2024), Báo cáo Chỉ số Thương mại điện tử Việt Nam (EBI) 2024, nguồn link trực tuyến: https://vecom.vn/bao-cao-ebi, ngày truy cập: 15/04/2026.</w:t>
       </w:r>
     </w:p>
     <w:p>

</xml_diff>

<commit_message>
doc: update figure and table numbering format to use chapter-based prefix (e.g. Table X.Y, Fig X.Y) in main report docx and markdown chapters
</commit_message>
<xml_diff>
--- a/BCKL_KsorPhuk.docx
+++ b/BCKL_KsorPhuk.docx
@@ -17644,85 +17644,9 @@
         </w:rPr>
       </w:pPr>
       <w:r>
-        <w:rPr>
-          <w:lang w:val="vi-VN"/>
-        </w:rPr>
-        <w:fldChar w:fldCharType="begin"/>
-      </w:r>
-      <w:r>
-        <w:rPr>
-          <w:lang w:val="vi-VN"/>
-        </w:rPr>
-        <w:instrText>TOC \c "Bảng"</w:instrText>
-      </w:r>
-      <w:r>
-        <w:rPr>
-          <w:lang w:val="vi-VN"/>
-        </w:rPr>
-        <w:fldChar w:fldCharType="separate"/>
-      </w:r>
-      <w:r>
-        <w:rPr>
-          <w:b/>
-          <w:noProof/>
-          <w:lang w:val="vi-VN"/>
-        </w:rPr>
-        <w:t xml:space="preserve">Bảng </w:t>
-      </w:r>
-      <w:r>
-        <w:rPr>
-          <w:noProof/>
-          <w:lang w:val="vi-VN"/>
-        </w:rPr>
-        <w:t>1: Cấu trúc hoạt động bên trong của một ô nhớ LSTM</w:t>
-      </w:r>
-      <w:r>
-        <w:rPr>
-          <w:noProof/>
-          <w:lang w:val="vi-VN"/>
-        </w:rPr>
+        <w:t>Bảng 2.1: Cấu trúc hoạt động bên trong của một ô nhớ LSTM</w:t>
         <w:tab/>
-      </w:r>
-      <w:r>
-        <w:rPr>
-          <w:noProof/>
-          <w:lang w:val="vi-VN"/>
-        </w:rPr>
-        <w:fldChar w:fldCharType="begin"/>
-      </w:r>
-      <w:r>
-        <w:rPr>
-          <w:noProof/>
-          <w:lang w:val="vi-VN"/>
-        </w:rPr>
-        <w:instrText xml:space="preserve"> PAGEREF _Toc233743576 \h </w:instrText>
-      </w:r>
-      <w:r>
-        <w:rPr>
-          <w:noProof/>
-          <w:lang w:val="vi-VN"/>
-        </w:rPr>
-      </w:r>
-      <w:r>
-        <w:rPr>
-          <w:noProof/>
-          <w:lang w:val="vi-VN"/>
-        </w:rPr>
-        <w:fldChar w:fldCharType="separate"/>
-      </w:r>
-      <w:r>
-        <w:rPr>
-          <w:noProof/>
-          <w:lang w:val="vi-VN"/>
-        </w:rPr>
         <w:t>20</w:t>
-      </w:r>
-      <w:r>
-        <w:rPr>
-          <w:noProof/>
-          <w:lang w:val="vi-VN"/>
-        </w:rPr>
-        <w:fldChar w:fldCharType="end"/>
       </w:r>
     </w:p>
     <w:p>
@@ -17737,67 +17661,9 @@
         </w:rPr>
       </w:pPr>
       <w:r>
-        <w:rPr>
-          <w:b/>
-          <w:noProof/>
-          <w:lang w:val="vi-VN"/>
-        </w:rPr>
-        <w:t xml:space="preserve">Bảng </w:t>
-      </w:r>
-      <w:r>
-        <w:rPr>
-          <w:noProof/>
-          <w:lang w:val="vi-VN"/>
-        </w:rPr>
-        <w:t>2: Phân bổ số lượng mẫu theo khía cạnh và cảm xúc trên tập Gold Eval</w:t>
-      </w:r>
-      <w:r>
-        <w:rPr>
-          <w:noProof/>
-          <w:lang w:val="vi-VN"/>
-        </w:rPr>
+        <w:t>Bảng 3.1: Phân bổ số lượng mẫu theo khía cạnh và cảm xúc trên tập Gold Eval</w:t>
         <w:tab/>
-      </w:r>
-      <w:r>
-        <w:rPr>
-          <w:noProof/>
-          <w:lang w:val="vi-VN"/>
-        </w:rPr>
-        <w:fldChar w:fldCharType="begin"/>
-      </w:r>
-      <w:r>
-        <w:rPr>
-          <w:noProof/>
-          <w:lang w:val="vi-VN"/>
-        </w:rPr>
-        <w:instrText xml:space="preserve"> PAGEREF _Toc233743577 \h </w:instrText>
-      </w:r>
-      <w:r>
-        <w:rPr>
-          <w:noProof/>
-          <w:lang w:val="vi-VN"/>
-        </w:rPr>
-      </w:r>
-      <w:r>
-        <w:rPr>
-          <w:noProof/>
-          <w:lang w:val="vi-VN"/>
-        </w:rPr>
-        <w:fldChar w:fldCharType="separate"/>
-      </w:r>
-      <w:r>
-        <w:rPr>
-          <w:noProof/>
-          <w:lang w:val="vi-VN"/>
-        </w:rPr>
         <w:t>28</w:t>
-      </w:r>
-      <w:r>
-        <w:rPr>
-          <w:noProof/>
-          <w:lang w:val="vi-VN"/>
-        </w:rPr>
-        <w:fldChar w:fldCharType="end"/>
       </w:r>
     </w:p>
     <w:p>
@@ -17812,67 +17678,9 @@
         </w:rPr>
       </w:pPr>
       <w:r>
-        <w:rPr>
-          <w:b/>
-          <w:noProof/>
-          <w:lang w:val="vi-VN"/>
-        </w:rPr>
-        <w:t xml:space="preserve">Bảng </w:t>
-      </w:r>
-      <w:r>
-        <w:rPr>
-          <w:noProof/>
-          <w:lang w:val="vi-VN"/>
-        </w:rPr>
-        <w:t>3: Danh sách ánh xạ chuẩn hóa biểu tượng cảm xúc tiêu biểu</w:t>
-      </w:r>
-      <w:r>
-        <w:rPr>
-          <w:noProof/>
-          <w:lang w:val="vi-VN"/>
-        </w:rPr>
+        <w:t>Bảng 3.2: Danh sách ánh xạ chuẩn hóa biểu tượng cảm xúc tiêu biểu</w:t>
         <w:tab/>
-      </w:r>
-      <w:r>
-        <w:rPr>
-          <w:noProof/>
-          <w:lang w:val="vi-VN"/>
-        </w:rPr>
-        <w:fldChar w:fldCharType="begin"/>
-      </w:r>
-      <w:r>
-        <w:rPr>
-          <w:noProof/>
-          <w:lang w:val="vi-VN"/>
-        </w:rPr>
-        <w:instrText xml:space="preserve"> PAGEREF _Toc233743578 \h </w:instrText>
-      </w:r>
-      <w:r>
-        <w:rPr>
-          <w:noProof/>
-          <w:lang w:val="vi-VN"/>
-        </w:rPr>
-      </w:r>
-      <w:r>
-        <w:rPr>
-          <w:noProof/>
-          <w:lang w:val="vi-VN"/>
-        </w:rPr>
-        <w:fldChar w:fldCharType="separate"/>
-      </w:r>
-      <w:r>
-        <w:rPr>
-          <w:noProof/>
-          <w:lang w:val="vi-VN"/>
-        </w:rPr>
         <w:t>30</w:t>
-      </w:r>
-      <w:r>
-        <w:rPr>
-          <w:noProof/>
-          <w:lang w:val="vi-VN"/>
-        </w:rPr>
-        <w:fldChar w:fldCharType="end"/>
       </w:r>
     </w:p>
     <w:p>
@@ -17887,67 +17695,9 @@
         </w:rPr>
       </w:pPr>
       <w:r>
-        <w:rPr>
-          <w:b/>
-          <w:noProof/>
-          <w:lang w:val="vi-VN"/>
-        </w:rPr>
-        <w:t xml:space="preserve">Bảng </w:t>
-      </w:r>
-      <w:r>
-        <w:rPr>
-          <w:noProof/>
-          <w:lang w:val="vi-VN"/>
-        </w:rPr>
-        <w:t>4: Bảng ánh xạ teencode và thuật ngữ viết tắt trong thương mại điện tử</w:t>
-      </w:r>
-      <w:r>
-        <w:rPr>
-          <w:noProof/>
-          <w:lang w:val="vi-VN"/>
-        </w:rPr>
+        <w:t>Bảng 3.3: Bảng ánh xạ teencode và thuật ngữ viết tắt trong thương mại điện tử</w:t>
         <w:tab/>
-      </w:r>
-      <w:r>
-        <w:rPr>
-          <w:noProof/>
-          <w:lang w:val="vi-VN"/>
-        </w:rPr>
-        <w:fldChar w:fldCharType="begin"/>
-      </w:r>
-      <w:r>
-        <w:rPr>
-          <w:noProof/>
-          <w:lang w:val="vi-VN"/>
-        </w:rPr>
-        <w:instrText xml:space="preserve"> PAGEREF _Toc233743579 \h </w:instrText>
-      </w:r>
-      <w:r>
-        <w:rPr>
-          <w:noProof/>
-          <w:lang w:val="vi-VN"/>
-        </w:rPr>
-      </w:r>
-      <w:r>
-        <w:rPr>
-          <w:noProof/>
-          <w:lang w:val="vi-VN"/>
-        </w:rPr>
-        <w:fldChar w:fldCharType="separate"/>
-      </w:r>
-      <w:r>
-        <w:rPr>
-          <w:noProof/>
-          <w:lang w:val="vi-VN"/>
-        </w:rPr>
         <w:t>31</w:t>
-      </w:r>
-      <w:r>
-        <w:rPr>
-          <w:noProof/>
-          <w:lang w:val="vi-VN"/>
-        </w:rPr>
-        <w:fldChar w:fldCharType="end"/>
       </w:r>
     </w:p>
     <w:p>
@@ -17962,67 +17712,9 @@
         </w:rPr>
       </w:pPr>
       <w:r>
-        <w:rPr>
-          <w:b/>
-          <w:noProof/>
-          <w:lang w:val="vi-VN"/>
-        </w:rPr>
-        <w:t xml:space="preserve">Bảng </w:t>
-      </w:r>
-      <w:r>
-        <w:rPr>
-          <w:noProof/>
-          <w:lang w:val="vi-VN"/>
-        </w:rPr>
-        <w:t>5: Kiến trúc mô hình đa nhiệm PhoBERT Multi-task</w:t>
-      </w:r>
-      <w:r>
-        <w:rPr>
-          <w:noProof/>
-          <w:lang w:val="vi-VN"/>
-        </w:rPr>
+        <w:t>Bảng 3.4: Kiến trúc mô hình đa nhiệm PhoBERT Multi-task</w:t>
         <w:tab/>
-      </w:r>
-      <w:r>
-        <w:rPr>
-          <w:noProof/>
-          <w:lang w:val="vi-VN"/>
-        </w:rPr>
-        <w:fldChar w:fldCharType="begin"/>
-      </w:r>
-      <w:r>
-        <w:rPr>
-          <w:noProof/>
-          <w:lang w:val="vi-VN"/>
-        </w:rPr>
-        <w:instrText xml:space="preserve"> PAGEREF _Toc233743580 \h </w:instrText>
-      </w:r>
-      <w:r>
-        <w:rPr>
-          <w:noProof/>
-          <w:lang w:val="vi-VN"/>
-        </w:rPr>
-      </w:r>
-      <w:r>
-        <w:rPr>
-          <w:noProof/>
-          <w:lang w:val="vi-VN"/>
-        </w:rPr>
-        <w:fldChar w:fldCharType="separate"/>
-      </w:r>
-      <w:r>
-        <w:rPr>
-          <w:noProof/>
-          <w:lang w:val="vi-VN"/>
-        </w:rPr>
         <w:t>36</w:t>
-      </w:r>
-      <w:r>
-        <w:rPr>
-          <w:noProof/>
-          <w:lang w:val="vi-VN"/>
-        </w:rPr>
-        <w:fldChar w:fldCharType="end"/>
       </w:r>
     </w:p>
     <w:p>
@@ -18037,67 +17729,9 @@
         </w:rPr>
       </w:pPr>
       <w:r>
-        <w:rPr>
-          <w:b/>
-          <w:noProof/>
-          <w:lang w:val="vi-VN"/>
-        </w:rPr>
-        <w:t xml:space="preserve">Bảng </w:t>
-      </w:r>
-      <w:r>
-        <w:rPr>
-          <w:noProof/>
-          <w:lang w:val="vi-VN"/>
-        </w:rPr>
-        <w:t>6: So sánh tổng quan hiệu năng các mô hình ABSA</w:t>
-      </w:r>
-      <w:r>
-        <w:rPr>
-          <w:noProof/>
-          <w:lang w:val="vi-VN"/>
-        </w:rPr>
+        <w:t>Bảng 4.1: So sánh tổng quan hiệu năng các mô hình ABSA</w:t>
         <w:tab/>
-      </w:r>
-      <w:r>
-        <w:rPr>
-          <w:noProof/>
-          <w:lang w:val="vi-VN"/>
-        </w:rPr>
-        <w:fldChar w:fldCharType="begin"/>
-      </w:r>
-      <w:r>
-        <w:rPr>
-          <w:noProof/>
-          <w:lang w:val="vi-VN"/>
-        </w:rPr>
-        <w:instrText xml:space="preserve"> PAGEREF _Toc233743581 \h </w:instrText>
-      </w:r>
-      <w:r>
-        <w:rPr>
-          <w:noProof/>
-          <w:lang w:val="vi-VN"/>
-        </w:rPr>
-      </w:r>
-      <w:r>
-        <w:rPr>
-          <w:noProof/>
-          <w:lang w:val="vi-VN"/>
-        </w:rPr>
-        <w:fldChar w:fldCharType="separate"/>
-      </w:r>
-      <w:r>
-        <w:rPr>
-          <w:noProof/>
-          <w:lang w:val="vi-VN"/>
-        </w:rPr>
         <w:t>39</w:t>
-      </w:r>
-      <w:r>
-        <w:rPr>
-          <w:noProof/>
-          <w:lang w:val="vi-VN"/>
-        </w:rPr>
-        <w:fldChar w:fldCharType="end"/>
       </w:r>
     </w:p>
     <w:p>
@@ -18112,67 +17746,9 @@
         </w:rPr>
       </w:pPr>
       <w:r>
-        <w:rPr>
-          <w:b/>
-          <w:noProof/>
-          <w:lang w:val="vi-VN"/>
-        </w:rPr>
-        <w:t xml:space="preserve">Bảng </w:t>
-      </w:r>
-      <w:r>
-        <w:rPr>
-          <w:noProof/>
-          <w:lang w:val="vi-VN"/>
-        </w:rPr>
-        <w:t>7: So sánh chi tiết hiệu năng Aspect-specific F1-score</w:t>
-      </w:r>
-      <w:r>
-        <w:rPr>
-          <w:noProof/>
-          <w:lang w:val="vi-VN"/>
-        </w:rPr>
+        <w:t>Bảng 4.2: So sánh chi tiết hiệu năng Aspect-specific F1-score</w:t>
         <w:tab/>
-      </w:r>
-      <w:r>
-        <w:rPr>
-          <w:noProof/>
-          <w:lang w:val="vi-VN"/>
-        </w:rPr>
-        <w:fldChar w:fldCharType="begin"/>
-      </w:r>
-      <w:r>
-        <w:rPr>
-          <w:noProof/>
-          <w:lang w:val="vi-VN"/>
-        </w:rPr>
-        <w:instrText xml:space="preserve"> PAGEREF _Toc233743582 \h </w:instrText>
-      </w:r>
-      <w:r>
-        <w:rPr>
-          <w:noProof/>
-          <w:lang w:val="vi-VN"/>
-        </w:rPr>
-      </w:r>
-      <w:r>
-        <w:rPr>
-          <w:noProof/>
-          <w:lang w:val="vi-VN"/>
-        </w:rPr>
-        <w:fldChar w:fldCharType="separate"/>
-      </w:r>
-      <w:r>
-        <w:rPr>
-          <w:noProof/>
-          <w:lang w:val="vi-VN"/>
-        </w:rPr>
         <w:t>39</w:t>
-      </w:r>
-      <w:r>
-        <w:rPr>
-          <w:noProof/>
-          <w:lang w:val="vi-VN"/>
-        </w:rPr>
-        <w:fldChar w:fldCharType="end"/>
       </w:r>
     </w:p>
     <w:p>
@@ -18187,67 +17763,9 @@
         </w:rPr>
       </w:pPr>
       <w:r>
-        <w:rPr>
-          <w:b/>
-          <w:noProof/>
-          <w:lang w:val="vi-VN"/>
-        </w:rPr>
-        <w:t xml:space="preserve">Bảng </w:t>
-      </w:r>
-      <w:r>
-        <w:rPr>
-          <w:noProof/>
-          <w:lang w:val="vi-VN"/>
-        </w:rPr>
-        <w:t>8: So sánh đối chiếu học thuật giữa bài báo gốc UIT-VSFC và đề tài khóa luận</w:t>
-      </w:r>
-      <w:r>
-        <w:rPr>
-          <w:noProof/>
-          <w:lang w:val="vi-VN"/>
-        </w:rPr>
+        <w:t>Bảng 4.3: So sánh đối chiếu học thuật giữa bài báo gốc UIT-VSFC và đề tài khóa luận</w:t>
         <w:tab/>
-      </w:r>
-      <w:r>
-        <w:rPr>
-          <w:noProof/>
-          <w:lang w:val="vi-VN"/>
-        </w:rPr>
-        <w:fldChar w:fldCharType="begin"/>
-      </w:r>
-      <w:r>
-        <w:rPr>
-          <w:noProof/>
-          <w:lang w:val="vi-VN"/>
-        </w:rPr>
-        <w:instrText xml:space="preserve"> PAGEREF _Toc233743583 \h </w:instrText>
-      </w:r>
-      <w:r>
-        <w:rPr>
-          <w:noProof/>
-          <w:lang w:val="vi-VN"/>
-        </w:rPr>
-      </w:r>
-      <w:r>
-        <w:rPr>
-          <w:noProof/>
-          <w:lang w:val="vi-VN"/>
-        </w:rPr>
-        <w:fldChar w:fldCharType="separate"/>
-      </w:r>
-      <w:r>
-        <w:rPr>
-          <w:noProof/>
-          <w:lang w:val="vi-VN"/>
-        </w:rPr>
         <w:t>42</w:t>
-      </w:r>
-      <w:r>
-        <w:rPr>
-          <w:noProof/>
-          <w:lang w:val="vi-VN"/>
-        </w:rPr>
-        <w:fldChar w:fldCharType="end"/>
       </w:r>
     </w:p>
     <w:p>
@@ -18262,67 +17780,9 @@
         </w:rPr>
       </w:pPr>
       <w:r>
-        <w:rPr>
-          <w:b/>
-          <w:noProof/>
-          <w:lang w:val="vi-VN"/>
-        </w:rPr>
-        <w:t xml:space="preserve">Bảng </w:t>
-      </w:r>
-      <w:r>
-        <w:rPr>
-          <w:noProof/>
-          <w:lang w:val="vi-VN"/>
-        </w:rPr>
-        <w:t>9: Hệ thống giải pháp tối ưu hóa kinh doanh theo khung RACE</w:t>
-      </w:r>
-      <w:r>
-        <w:rPr>
-          <w:noProof/>
-          <w:lang w:val="vi-VN"/>
-        </w:rPr>
+        <w:t>Bảng 4.4: Hệ thống giải pháp tối ưu hóa kinh doanh theo khung RACE</w:t>
         <w:tab/>
-      </w:r>
-      <w:r>
-        <w:rPr>
-          <w:noProof/>
-          <w:lang w:val="vi-VN"/>
-        </w:rPr>
-        <w:fldChar w:fldCharType="begin"/>
-      </w:r>
-      <w:r>
-        <w:rPr>
-          <w:noProof/>
-          <w:lang w:val="vi-VN"/>
-        </w:rPr>
-        <w:instrText xml:space="preserve"> PAGEREF _Toc233743584 \h </w:instrText>
-      </w:r>
-      <w:r>
-        <w:rPr>
-          <w:noProof/>
-          <w:lang w:val="vi-VN"/>
-        </w:rPr>
-      </w:r>
-      <w:r>
-        <w:rPr>
-          <w:noProof/>
-          <w:lang w:val="vi-VN"/>
-        </w:rPr>
-        <w:fldChar w:fldCharType="separate"/>
-      </w:r>
-      <w:r>
-        <w:rPr>
-          <w:noProof/>
-          <w:lang w:val="vi-VN"/>
-        </w:rPr>
         <w:t>47</w:t>
-      </w:r>
-      <w:r>
-        <w:rPr>
-          <w:noProof/>
-          <w:lang w:val="vi-VN"/>
-        </w:rPr>
-        <w:fldChar w:fldCharType="end"/>
       </w:r>
     </w:p>
     <w:p>
@@ -18396,85 +17856,9 @@
         </w:rPr>
       </w:pPr>
       <w:r>
-        <w:rPr>
-          <w:lang w:val="vi-VN"/>
-        </w:rPr>
-        <w:fldChar w:fldCharType="begin"/>
-      </w:r>
-      <w:r>
-        <w:rPr>
-          <w:lang w:val="vi-VN"/>
-        </w:rPr>
-        <w:instrText>TOC \c "Hình"</w:instrText>
-      </w:r>
-      <w:r>
-        <w:rPr>
-          <w:lang w:val="vi-VN"/>
-        </w:rPr>
-        <w:fldChar w:fldCharType="separate"/>
-      </w:r>
-      <w:r>
-        <w:rPr>
-          <w:b/>
-          <w:noProof/>
-          <w:lang w:val="vi-VN"/>
-        </w:rPr>
-        <w:t xml:space="preserve">Hình </w:t>
-      </w:r>
-      <w:r>
-        <w:rPr>
-          <w:noProof/>
-          <w:lang w:val="vi-VN"/>
-        </w:rPr>
-        <w:t>1: Quy trình KDD 5 bước áp dụng trong nghiên cứu</w:t>
-      </w:r>
-      <w:r>
-        <w:rPr>
-          <w:noProof/>
-          <w:lang w:val="vi-VN"/>
-        </w:rPr>
+        <w:t>Hình 1.1: Quy trình KDD 5 bước áp dụng trong nghiên cứu</w:t>
         <w:tab/>
-      </w:r>
-      <w:r>
-        <w:rPr>
-          <w:noProof/>
-          <w:lang w:val="vi-VN"/>
-        </w:rPr>
-        <w:fldChar w:fldCharType="begin"/>
-      </w:r>
-      <w:r>
-        <w:rPr>
-          <w:noProof/>
-          <w:lang w:val="vi-VN"/>
-        </w:rPr>
-        <w:instrText xml:space="preserve"> PAGEREF _Toc233743585 \h </w:instrText>
-      </w:r>
-      <w:r>
-        <w:rPr>
-          <w:noProof/>
-          <w:lang w:val="vi-VN"/>
-        </w:rPr>
-      </w:r>
-      <w:r>
-        <w:rPr>
-          <w:noProof/>
-          <w:lang w:val="vi-VN"/>
-        </w:rPr>
-        <w:fldChar w:fldCharType="separate"/>
-      </w:r>
-      <w:r>
-        <w:rPr>
-          <w:noProof/>
-          <w:lang w:val="vi-VN"/>
-        </w:rPr>
         <w:t>6</w:t>
-      </w:r>
-      <w:r>
-        <w:rPr>
-          <w:noProof/>
-          <w:lang w:val="vi-VN"/>
-        </w:rPr>
-        <w:fldChar w:fldCharType="end"/>
       </w:r>
     </w:p>
     <w:p>
@@ -18494,67 +17878,9 @@
         </w:rPr>
       </w:pPr>
       <w:r>
-        <w:rPr>
-          <w:b/>
-          <w:noProof/>
-          <w:lang w:val="vi-VN"/>
-        </w:rPr>
-        <w:t xml:space="preserve">Hình </w:t>
-      </w:r>
-      <w:r>
-        <w:rPr>
-          <w:noProof/>
-          <w:lang w:val="vi-VN"/>
-        </w:rPr>
-        <w:t>2: Sơ đồ so sánh hai kiến trúc CBOW và Skip-gram của Word2Vec</w:t>
-      </w:r>
-      <w:r>
-        <w:rPr>
-          <w:noProof/>
-          <w:lang w:val="vi-VN"/>
-        </w:rPr>
+        <w:t>Hình 2.1: Sơ đồ so sánh hai kiến trúc CBOW và Skip-gram của Word2Vec</w:t>
         <w:tab/>
-      </w:r>
-      <w:r>
-        <w:rPr>
-          <w:noProof/>
-          <w:lang w:val="vi-VN"/>
-        </w:rPr>
-        <w:fldChar w:fldCharType="begin"/>
-      </w:r>
-      <w:r>
-        <w:rPr>
-          <w:noProof/>
-          <w:lang w:val="vi-VN"/>
-        </w:rPr>
-        <w:instrText xml:space="preserve"> PAGEREF _Toc233743586 \h </w:instrText>
-      </w:r>
-      <w:r>
-        <w:rPr>
-          <w:noProof/>
-          <w:lang w:val="vi-VN"/>
-        </w:rPr>
-      </w:r>
-      <w:r>
-        <w:rPr>
-          <w:noProof/>
-          <w:lang w:val="vi-VN"/>
-        </w:rPr>
-        <w:fldChar w:fldCharType="separate"/>
-      </w:r>
-      <w:r>
-        <w:rPr>
-          <w:noProof/>
-          <w:lang w:val="vi-VN"/>
-        </w:rPr>
         <w:t>15</w:t>
-      </w:r>
-      <w:r>
-        <w:rPr>
-          <w:noProof/>
-          <w:lang w:val="vi-VN"/>
-        </w:rPr>
-        <w:fldChar w:fldCharType="end"/>
       </w:r>
     </w:p>
     <w:p>
@@ -18574,67 +17900,9 @@
         </w:rPr>
       </w:pPr>
       <w:r>
-        <w:rPr>
-          <w:b/>
-          <w:noProof/>
-          <w:lang w:val="vi-VN"/>
-        </w:rPr>
-        <w:t xml:space="preserve">Hình </w:t>
-      </w:r>
-      <w:r>
-        <w:rPr>
-          <w:noProof/>
-          <w:lang w:val="vi-VN"/>
-        </w:rPr>
-        <w:t>3: Vòng đời khách hàng theo khung chiến lược tiếp thị số RACE</w:t>
-      </w:r>
-      <w:r>
-        <w:rPr>
-          <w:noProof/>
-          <w:lang w:val="vi-VN"/>
-        </w:rPr>
+        <w:t>Hình 2.2: Vòng đời khách hàng theo khung chiến lược tiếp thị số RACE</w:t>
         <w:tab/>
-      </w:r>
-      <w:r>
-        <w:rPr>
-          <w:noProof/>
-          <w:lang w:val="vi-VN"/>
-        </w:rPr>
-        <w:fldChar w:fldCharType="begin"/>
-      </w:r>
-      <w:r>
-        <w:rPr>
-          <w:noProof/>
-          <w:lang w:val="vi-VN"/>
-        </w:rPr>
-        <w:instrText xml:space="preserve"> PAGEREF _Toc233743587 \h </w:instrText>
-      </w:r>
-      <w:r>
-        <w:rPr>
-          <w:noProof/>
-          <w:lang w:val="vi-VN"/>
-        </w:rPr>
-      </w:r>
-      <w:r>
-        <w:rPr>
-          <w:noProof/>
-          <w:lang w:val="vi-VN"/>
-        </w:rPr>
-        <w:fldChar w:fldCharType="separate"/>
-      </w:r>
-      <w:r>
-        <w:rPr>
-          <w:noProof/>
-          <w:lang w:val="vi-VN"/>
-        </w:rPr>
         <w:t>25</w:t>
-      </w:r>
-      <w:r>
-        <w:rPr>
-          <w:noProof/>
-          <w:lang w:val="vi-VN"/>
-        </w:rPr>
-        <w:fldChar w:fldCharType="end"/>
       </w:r>
     </w:p>
     <w:p>
@@ -18654,67 +17922,9 @@
         </w:rPr>
       </w:pPr>
       <w:r>
-        <w:rPr>
-          <w:b/>
-          <w:noProof/>
-          <w:lang w:val="vi-VN"/>
-        </w:rPr>
-        <w:t xml:space="preserve">Hình </w:t>
-      </w:r>
-      <w:r>
-        <w:rPr>
-          <w:noProof/>
-          <w:lang w:val="vi-VN"/>
-        </w:rPr>
-        <w:t>4: Chi tiết quy trình NLP Pipeline làm sạch văn bản</w:t>
-      </w:r>
-      <w:r>
-        <w:rPr>
-          <w:noProof/>
-          <w:lang w:val="vi-VN"/>
-        </w:rPr>
+        <w:t>Hình 3.1: Chi tiết quy trình NLP Pipeline làm sạch văn bản</w:t>
         <w:tab/>
-      </w:r>
-      <w:r>
-        <w:rPr>
-          <w:noProof/>
-          <w:lang w:val="vi-VN"/>
-        </w:rPr>
-        <w:fldChar w:fldCharType="begin"/>
-      </w:r>
-      <w:r>
-        <w:rPr>
-          <w:noProof/>
-          <w:lang w:val="vi-VN"/>
-        </w:rPr>
-        <w:instrText xml:space="preserve"> PAGEREF _Toc233743588 \h </w:instrText>
-      </w:r>
-      <w:r>
-        <w:rPr>
-          <w:noProof/>
-          <w:lang w:val="vi-VN"/>
-        </w:rPr>
-      </w:r>
-      <w:r>
-        <w:rPr>
-          <w:noProof/>
-          <w:lang w:val="vi-VN"/>
-        </w:rPr>
-        <w:fldChar w:fldCharType="separate"/>
-      </w:r>
-      <w:r>
-        <w:rPr>
-          <w:noProof/>
-          <w:lang w:val="vi-VN"/>
-        </w:rPr>
         <w:t>29</w:t>
-      </w:r>
-      <w:r>
-        <w:rPr>
-          <w:noProof/>
-          <w:lang w:val="vi-VN"/>
-        </w:rPr>
-        <w:fldChar w:fldCharType="end"/>
       </w:r>
     </w:p>
     <w:p>
@@ -19483,54 +18693,9 @@
           <w:lang w:val="vi-VN"/>
         </w:rPr>
       </w:pPr>
-      <w:bookmarkStart w:id="16" w:name="_Toc233743585"/>
-      <w:r>
-        <w:rPr>
-          <w:b/>
-          <w:sz w:val="22"/>
-          <w:lang w:val="vi-VN"/>
-        </w:rPr>
-        <w:t xml:space="preserve">Hình </w:t>
-      </w:r>
-      <w:r>
-        <w:rPr>
-          <w:lang w:val="vi-VN"/>
-        </w:rPr>
-        <w:fldChar w:fldCharType="begin"/>
-      </w:r>
-      <w:r>
-        <w:rPr>
-          <w:lang w:val="vi-VN"/>
-        </w:rPr>
-        <w:instrText>SEQ Hình \* ARABIC</w:instrText>
-      </w:r>
-      <w:r>
-        <w:rPr>
-          <w:lang w:val="vi-VN"/>
-        </w:rPr>
-        <w:fldChar w:fldCharType="separate"/>
-      </w:r>
-      <w:r>
-        <w:rPr>
-          <w:noProof/>
-          <w:lang w:val="vi-VN"/>
-        </w:rPr>
-        <w:t>1</w:t>
-      </w:r>
-      <w:r>
-        <w:rPr>
-          <w:lang w:val="vi-VN"/>
-        </w:rPr>
-        <w:fldChar w:fldCharType="end"/>
-      </w:r>
-      <w:r>
-        <w:rPr>
-          <w:sz w:val="22"/>
-          <w:lang w:val="vi-VN"/>
-        </w:rPr>
-        <w:t>: Quy trình KDD 5 bước áp dụng trong nghiên cứu</w:t>
-      </w:r>
-      <w:bookmarkEnd w:id="16"/>
+      <w:r>
+        <w:t>Hình 1.1: Quy trình KDD 5 bước áp dụng trong nghiên cứu</w:t>
+      </w:r>
     </w:p>
     <w:p>
       <w:pPr>
@@ -23299,54 +22464,9 @@
           <w:lang w:val="vi-VN"/>
         </w:rPr>
       </w:pPr>
-      <w:bookmarkStart w:id="27" w:name="_Toc233743586"/>
-      <w:r>
-        <w:rPr>
-          <w:b/>
-          <w:sz w:val="22"/>
-          <w:lang w:val="vi-VN"/>
-        </w:rPr>
-        <w:t xml:space="preserve">Hình </w:t>
-      </w:r>
-      <w:r>
-        <w:rPr>
-          <w:lang w:val="vi-VN"/>
-        </w:rPr>
-        <w:fldChar w:fldCharType="begin"/>
-      </w:r>
-      <w:r>
-        <w:rPr>
-          <w:lang w:val="vi-VN"/>
-        </w:rPr>
-        <w:instrText>SEQ Hình \* ARABIC</w:instrText>
-      </w:r>
-      <w:r>
-        <w:rPr>
-          <w:lang w:val="vi-VN"/>
-        </w:rPr>
-        <w:fldChar w:fldCharType="separate"/>
-      </w:r>
-      <w:r>
-        <w:rPr>
-          <w:noProof/>
-          <w:lang w:val="vi-VN"/>
-        </w:rPr>
-        <w:t>2</w:t>
-      </w:r>
-      <w:r>
-        <w:rPr>
-          <w:lang w:val="vi-VN"/>
-        </w:rPr>
-        <w:fldChar w:fldCharType="end"/>
-      </w:r>
-      <w:r>
-        <w:rPr>
-          <w:sz w:val="22"/>
-          <w:lang w:val="vi-VN"/>
-        </w:rPr>
-        <w:t>: Sơ đồ so sánh hai kiến trúc CBOW và Skip-gram của Word2Vec</w:t>
-      </w:r>
-      <w:bookmarkEnd w:id="27"/>
+      <w:r>
+        <w:t>Hình 2.1: Sơ đồ so sánh hai kiến trúc CBOW và Skip-gram của Word2Vec</w:t>
+      </w:r>
     </w:p>
     <w:p>
       <w:pPr>
@@ -30864,54 +29984,9 @@
           <w:lang w:val="vi-VN"/>
         </w:rPr>
       </w:pPr>
-      <w:bookmarkStart w:id="34" w:name="_Toc233743576"/>
-      <w:r>
-        <w:rPr>
-          <w:b/>
-          <w:sz w:val="22"/>
-          <w:lang w:val="vi-VN"/>
-        </w:rPr>
-        <w:t xml:space="preserve">Bảng </w:t>
-      </w:r>
-      <w:r>
-        <w:rPr>
-          <w:lang w:val="vi-VN"/>
-        </w:rPr>
-        <w:fldChar w:fldCharType="begin"/>
-      </w:r>
-      <w:r>
-        <w:rPr>
-          <w:lang w:val="vi-VN"/>
-        </w:rPr>
-        <w:instrText>SEQ Bảng \* ARABIC</w:instrText>
-      </w:r>
-      <w:r>
-        <w:rPr>
-          <w:lang w:val="vi-VN"/>
-        </w:rPr>
-        <w:fldChar w:fldCharType="separate"/>
-      </w:r>
-      <w:r>
-        <w:rPr>
-          <w:noProof/>
-          <w:lang w:val="vi-VN"/>
-        </w:rPr>
-        <w:t>1</w:t>
-      </w:r>
-      <w:r>
-        <w:rPr>
-          <w:lang w:val="vi-VN"/>
-        </w:rPr>
-        <w:fldChar w:fldCharType="end"/>
-      </w:r>
-      <w:r>
-        <w:rPr>
-          <w:sz w:val="22"/>
-          <w:lang w:val="vi-VN"/>
-        </w:rPr>
-        <w:t>: Cấu trúc hoạt động bên trong của một ô nhớ LSTM</w:t>
-      </w:r>
-      <w:bookmarkEnd w:id="34"/>
+      <w:r>
+        <w:t>Bảng 2.1: Cấu trúc hoạt động bên trong của một ô nhớ LSTM</w:t>
+      </w:r>
     </w:p>
     <w:p>
       <w:pPr>
@@ -36006,54 +35081,9 @@
           <w:lang w:val="vi-VN"/>
         </w:rPr>
       </w:pPr>
-      <w:bookmarkStart w:id="42" w:name="_Toc233743587"/>
-      <w:r>
-        <w:rPr>
-          <w:b/>
-          <w:sz w:val="22"/>
-          <w:lang w:val="vi-VN"/>
-        </w:rPr>
-        <w:t xml:space="preserve">Hình </w:t>
-      </w:r>
-      <w:r>
-        <w:rPr>
-          <w:lang w:val="vi-VN"/>
-        </w:rPr>
-        <w:fldChar w:fldCharType="begin"/>
-      </w:r>
-      <w:r>
-        <w:rPr>
-          <w:lang w:val="vi-VN"/>
-        </w:rPr>
-        <w:instrText>SEQ Hình \* ARABIC</w:instrText>
-      </w:r>
-      <w:r>
-        <w:rPr>
-          <w:lang w:val="vi-VN"/>
-        </w:rPr>
-        <w:fldChar w:fldCharType="separate"/>
-      </w:r>
-      <w:r>
-        <w:rPr>
-          <w:noProof/>
-          <w:lang w:val="vi-VN"/>
-        </w:rPr>
-        <w:t>3</w:t>
-      </w:r>
-      <w:r>
-        <w:rPr>
-          <w:lang w:val="vi-VN"/>
-        </w:rPr>
-        <w:fldChar w:fldCharType="end"/>
-      </w:r>
-      <w:r>
-        <w:rPr>
-          <w:sz w:val="22"/>
-          <w:lang w:val="vi-VN"/>
-        </w:rPr>
-        <w:t>: Vòng đời khách hàng theo khung chiến lược tiếp thị số RACE</w:t>
-      </w:r>
-      <w:bookmarkEnd w:id="42"/>
+      <w:r>
+        <w:t>Hình 2.2: Vòng đời khách hàng theo khung chiến lược tiếp thị số RACE</w:t>
+      </w:r>
     </w:p>
     <w:p>
       <w:pPr>
@@ -36511,7 +35541,7 @@
         <w:rPr>
           <w:lang w:val="vi-VN"/>
         </w:rPr>
-        <w:t>Trong thực tiễn khai phá dữ liệu thương mại điện tử, hiện tượng mất cân bằng lớp (class imbalance) là một thách thức kinh điển và cực kỳ nghiêm trọng. Để chứng minh tính thực tế và độ khó của tác vụ nghiên cứu, đề tài đã thống kê chi tiết sự phân bổ các khía cạnh (Aspects) chéo với các trạng thái cảm xúc (Sentiments) trên tập đánh giá chuẩn (Gold Evaluation). Bảng 2 dưới đây thể hiện sự phân bổ này:</w:t>
+        <w:t>Trong thực tiễn khai phá dữ liệu thương mại điện tử, hiện tượng mất cân bằng lớp (class imbalance) là một thách thức kinh điển và cực kỳ nghiêm trọng. Để chứng minh tính thực tế và độ khó của tác vụ nghiên cứu, đề tài đã thống kê chi tiết sự phân bổ các khía cạnh (Aspects) chéo với các trạng thái cảm xúc (Sentiments) trên tập đánh giá chuẩn (Gold Evaluation). Bảng 3.1 dưới đây thể hiện sự phân bổ này:</w:t>
       </w:r>
     </w:p>
     <w:p>
@@ -36522,54 +35552,9 @@
           <w:lang w:val="vi-VN"/>
         </w:rPr>
       </w:pPr>
-      <w:bookmarkStart w:id="47" w:name="_Toc233743577"/>
-      <w:r>
-        <w:rPr>
-          <w:b/>
-          <w:sz w:val="22"/>
-          <w:lang w:val="vi-VN"/>
-        </w:rPr>
-        <w:t xml:space="preserve">Bảng </w:t>
-      </w:r>
-      <w:r>
-        <w:rPr>
-          <w:lang w:val="vi-VN"/>
-        </w:rPr>
-        <w:fldChar w:fldCharType="begin"/>
-      </w:r>
-      <w:r>
-        <w:rPr>
-          <w:lang w:val="vi-VN"/>
-        </w:rPr>
-        <w:instrText>SEQ Bảng \* ARABIC</w:instrText>
-      </w:r>
-      <w:r>
-        <w:rPr>
-          <w:lang w:val="vi-VN"/>
-        </w:rPr>
-        <w:fldChar w:fldCharType="separate"/>
-      </w:r>
-      <w:r>
-        <w:rPr>
-          <w:noProof/>
-          <w:lang w:val="vi-VN"/>
-        </w:rPr>
-        <w:t>2</w:t>
-      </w:r>
-      <w:r>
-        <w:rPr>
-          <w:lang w:val="vi-VN"/>
-        </w:rPr>
-        <w:fldChar w:fldCharType="end"/>
-      </w:r>
-      <w:r>
-        <w:rPr>
-          <w:sz w:val="22"/>
-          <w:lang w:val="vi-VN"/>
-        </w:rPr>
-        <w:t>: Phân bổ số lượng mẫu theo khía cạnh và cảm xúc trên tập Gold Eval</w:t>
-      </w:r>
-      <w:bookmarkEnd w:id="47"/>
+      <w:r>
+        <w:t>Bảng 3.1: Phân bổ số lượng mẫu theo khía cạnh và cảm xúc trên tập Gold Eval</w:t>
+      </w:r>
     </w:p>
     <w:p>
       <w:pPr>
@@ -37665,7 +36650,7 @@
         <w:rPr>
           <w:lang w:val="vi-VN"/>
         </w:rPr>
-        <w:t>Dựa trên số liệu thống kê tại Bảng 2, ta có thể rút ra một số nhận xét khoa học quan trọng về đặc trưng phân bổ dữ liệu:</w:t>
+        <w:t>Dựa trên số liệu thống kê tại Bảng 3.1, ta có thể rút ra một số nhận xét khoa học quan trọng về đặc trưng phân bổ dữ liệu:</w:t>
       </w:r>
     </w:p>
     <w:p>
@@ -37800,7 +36785,7 @@
         <w:rPr>
           <w:lang w:val="vi-VN"/>
         </w:rPr>
-        <w:t>Để giải quyết độ nhiễu cao của ngôn ngữ mạng, một đường ống NLP Pipeline được thiết kế và lập trình trong mô-đun tiền xử lý dữ liệu. Quy trình bao gồm các bước tuần tự được thể hiện trong Hình 4:</w:t>
+        <w:t>Để giải quyết độ nhiễu cao của ngôn ngữ mạng, một đường ống NLP Pipeline được thiết kế và lập trình trong mô-đun tiền xử lý dữ liệu. Quy trình bao gồm các bước tuần tự được thể hiện trong Hình 3.1:</w:t>
       </w:r>
     </w:p>
     <w:p>
@@ -37811,54 +36796,9 @@
           <w:lang w:val="vi-VN"/>
         </w:rPr>
       </w:pPr>
-      <w:bookmarkStart w:id="49" w:name="_Toc233743588"/>
-      <w:r>
-        <w:rPr>
-          <w:b/>
-          <w:sz w:val="22"/>
-          <w:lang w:val="vi-VN"/>
-        </w:rPr>
-        <w:t xml:space="preserve">Hình </w:t>
-      </w:r>
-      <w:r>
-        <w:rPr>
-          <w:lang w:val="vi-VN"/>
-        </w:rPr>
-        <w:fldChar w:fldCharType="begin"/>
-      </w:r>
-      <w:r>
-        <w:rPr>
-          <w:lang w:val="vi-VN"/>
-        </w:rPr>
-        <w:instrText>SEQ Hình \* ARABIC</w:instrText>
-      </w:r>
-      <w:r>
-        <w:rPr>
-          <w:lang w:val="vi-VN"/>
-        </w:rPr>
-        <w:fldChar w:fldCharType="separate"/>
-      </w:r>
-      <w:r>
-        <w:rPr>
-          <w:noProof/>
-          <w:lang w:val="vi-VN"/>
-        </w:rPr>
-        <w:t>4</w:t>
-      </w:r>
-      <w:r>
-        <w:rPr>
-          <w:lang w:val="vi-VN"/>
-        </w:rPr>
-        <w:fldChar w:fldCharType="end"/>
-      </w:r>
-      <w:r>
-        <w:rPr>
-          <w:sz w:val="22"/>
-          <w:lang w:val="vi-VN"/>
-        </w:rPr>
-        <w:t>: Chi tiết quy trình NLP Pipeline làm sạch văn bản</w:t>
-      </w:r>
-      <w:bookmarkEnd w:id="49"/>
+      <w:r>
+        <w:t>Hình 3.1: Chi tiết quy trình NLP Pipeline làm sạch văn bản</w:t>
+      </w:r>
     </w:p>
     <w:p>
       <w:pPr>
@@ -38140,54 +37080,9 @@
           <w:lang w:val="vi-VN"/>
         </w:rPr>
       </w:pPr>
-      <w:bookmarkStart w:id="53" w:name="_Toc233743578"/>
-      <w:r>
-        <w:rPr>
-          <w:b/>
-          <w:sz w:val="22"/>
-          <w:lang w:val="vi-VN"/>
-        </w:rPr>
-        <w:t xml:space="preserve">Bảng </w:t>
-      </w:r>
-      <w:r>
-        <w:rPr>
-          <w:lang w:val="vi-VN"/>
-        </w:rPr>
-        <w:fldChar w:fldCharType="begin"/>
-      </w:r>
-      <w:r>
-        <w:rPr>
-          <w:lang w:val="vi-VN"/>
-        </w:rPr>
-        <w:instrText>SEQ Bảng \* ARABIC</w:instrText>
-      </w:r>
-      <w:r>
-        <w:rPr>
-          <w:lang w:val="vi-VN"/>
-        </w:rPr>
-        <w:fldChar w:fldCharType="separate"/>
-      </w:r>
-      <w:r>
-        <w:rPr>
-          <w:noProof/>
-          <w:lang w:val="vi-VN"/>
-        </w:rPr>
-        <w:t>3</w:t>
-      </w:r>
-      <w:r>
-        <w:rPr>
-          <w:lang w:val="vi-VN"/>
-        </w:rPr>
-        <w:fldChar w:fldCharType="end"/>
-      </w:r>
-      <w:r>
-        <w:rPr>
-          <w:sz w:val="22"/>
-          <w:lang w:val="vi-VN"/>
-        </w:rPr>
-        <w:t>: Danh sách ánh xạ chuẩn hóa biểu tượng cảm xúc tiêu biểu</w:t>
-      </w:r>
-      <w:bookmarkEnd w:id="53"/>
+      <w:r>
+        <w:t>Bảng 3.2: Danh sách ánh xạ chuẩn hóa biểu tượng cảm xúc tiêu biểu</w:t>
+      </w:r>
     </w:p>
     <w:p>
       <w:pPr>
@@ -39119,54 +38014,9 @@
           <w:lang w:val="vi-VN"/>
         </w:rPr>
       </w:pPr>
-      <w:bookmarkStart w:id="55" w:name="_Toc233743579"/>
-      <w:r>
-        <w:rPr>
-          <w:b/>
-          <w:sz w:val="22"/>
-          <w:lang w:val="vi-VN"/>
-        </w:rPr>
-        <w:t xml:space="preserve">Bảng </w:t>
-      </w:r>
-      <w:r>
-        <w:rPr>
-          <w:lang w:val="vi-VN"/>
-        </w:rPr>
-        <w:fldChar w:fldCharType="begin"/>
-      </w:r>
-      <w:r>
-        <w:rPr>
-          <w:lang w:val="vi-VN"/>
-        </w:rPr>
-        <w:instrText>SEQ Bảng \* ARABIC</w:instrText>
-      </w:r>
-      <w:r>
-        <w:rPr>
-          <w:lang w:val="vi-VN"/>
-        </w:rPr>
-        <w:fldChar w:fldCharType="separate"/>
-      </w:r>
-      <w:r>
-        <w:rPr>
-          <w:noProof/>
-          <w:lang w:val="vi-VN"/>
-        </w:rPr>
-        <w:t>4</w:t>
-      </w:r>
-      <w:r>
-        <w:rPr>
-          <w:lang w:val="vi-VN"/>
-        </w:rPr>
-        <w:fldChar w:fldCharType="end"/>
-      </w:r>
-      <w:r>
-        <w:rPr>
-          <w:sz w:val="22"/>
-          <w:lang w:val="vi-VN"/>
-        </w:rPr>
-        <w:t>: Bảng ánh xạ teencode và thuật ngữ viết tắt trong thương mại điện tử</w:t>
-      </w:r>
-      <w:bookmarkEnd w:id="55"/>
+      <w:r>
+        <w:t>Bảng 3.3: Bảng ánh xạ teencode và thuật ngữ viết tắt trong thương mại điện tử</w:t>
+      </w:r>
     </w:p>
     <w:p>
       <w:pPr>
@@ -46337,54 +45187,9 @@
           <w:lang w:val="vi-VN"/>
         </w:rPr>
       </w:pPr>
-      <w:bookmarkStart w:id="62" w:name="_Toc233743580"/>
-      <w:r>
-        <w:rPr>
-          <w:b/>
-          <w:sz w:val="22"/>
-          <w:lang w:val="vi-VN"/>
-        </w:rPr>
-        <w:t xml:space="preserve">Bảng </w:t>
-      </w:r>
-      <w:r>
-        <w:rPr>
-          <w:lang w:val="vi-VN"/>
-        </w:rPr>
-        <w:fldChar w:fldCharType="begin"/>
-      </w:r>
-      <w:r>
-        <w:rPr>
-          <w:lang w:val="vi-VN"/>
-        </w:rPr>
-        <w:instrText>SEQ Bảng \* ARABIC</w:instrText>
-      </w:r>
-      <w:r>
-        <w:rPr>
-          <w:lang w:val="vi-VN"/>
-        </w:rPr>
-        <w:fldChar w:fldCharType="separate"/>
-      </w:r>
-      <w:r>
-        <w:rPr>
-          <w:noProof/>
-          <w:lang w:val="vi-VN"/>
-        </w:rPr>
-        <w:t>5</w:t>
-      </w:r>
-      <w:r>
-        <w:rPr>
-          <w:lang w:val="vi-VN"/>
-        </w:rPr>
-        <w:fldChar w:fldCharType="end"/>
-      </w:r>
-      <w:r>
-        <w:rPr>
-          <w:sz w:val="22"/>
-          <w:lang w:val="vi-VN"/>
-        </w:rPr>
-        <w:t>: Kiến trúc mô hình đa nhiệm PhoBERT Multi-task</w:t>
-      </w:r>
-      <w:bookmarkEnd w:id="62"/>
+      <w:r>
+        <w:t>Bảng 3.4: Kiến trúc mô hình đa nhiệm PhoBERT Multi-task</w:t>
+      </w:r>
     </w:p>
     <w:p>
       <w:pPr>
@@ -47411,7 +46216,7 @@
         <w:rPr>
           <w:lang w:val="vi-VN"/>
         </w:rPr>
-        <w:t>Bảng 6 trình bày các chỉ số hiệu năng tổng hợp của ba mô hình trong các tác vụ ACD và ATSC.</w:t>
+        <w:t>Bảng 4.1 trình bày các chỉ số hiệu năng tổng hợp của ba mô hình trong các tác vụ ACD và ATSC.</w:t>
       </w:r>
     </w:p>
     <w:p>
@@ -47422,54 +46227,9 @@
           <w:lang w:val="vi-VN"/>
         </w:rPr>
       </w:pPr>
-      <w:bookmarkStart w:id="66" w:name="_Toc233743581"/>
-      <w:r>
-        <w:rPr>
-          <w:b/>
-          <w:sz w:val="22"/>
-          <w:lang w:val="vi-VN"/>
-        </w:rPr>
-        <w:t xml:space="preserve">Bảng </w:t>
-      </w:r>
-      <w:r>
-        <w:rPr>
-          <w:lang w:val="vi-VN"/>
-        </w:rPr>
-        <w:fldChar w:fldCharType="begin"/>
-      </w:r>
-      <w:r>
-        <w:rPr>
-          <w:lang w:val="vi-VN"/>
-        </w:rPr>
-        <w:instrText>SEQ Bảng \* ARABIC</w:instrText>
-      </w:r>
-      <w:r>
-        <w:rPr>
-          <w:lang w:val="vi-VN"/>
-        </w:rPr>
-        <w:fldChar w:fldCharType="separate"/>
-      </w:r>
-      <w:r>
-        <w:rPr>
-          <w:noProof/>
-          <w:lang w:val="vi-VN"/>
-        </w:rPr>
-        <w:t>6</w:t>
-      </w:r>
-      <w:r>
-        <w:rPr>
-          <w:lang w:val="vi-VN"/>
-        </w:rPr>
-        <w:fldChar w:fldCharType="end"/>
-      </w:r>
-      <w:r>
-        <w:rPr>
-          <w:sz w:val="22"/>
-          <w:lang w:val="vi-VN"/>
-        </w:rPr>
-        <w:t>: So sánh tổng quan hiệu năng các mô hình ABSA</w:t>
-      </w:r>
-      <w:bookmarkEnd w:id="66"/>
+      <w:r>
+        <w:t>Bảng 4.1: So sánh tổng quan hiệu năng các mô hình ABSA</w:t>
+      </w:r>
     </w:p>
     <w:p>
       <w:pPr>
@@ -48273,7 +47033,7 @@
         <w:rPr>
           <w:lang w:val="vi-VN"/>
         </w:rPr>
-        <w:t>Bảng 7 đi sâu phân tích chỉ số F1-score chi tiết cho từng khía cạnh mục tiêu trong tập Gold Eval nhằm làm rõ khả năng nhận diện ngữ nghĩa cụ thể của từng thuật toán.</w:t>
+        <w:t>Bảng 4.2 đi sâu phân tích chỉ số F1-score chi tiết cho từng khía cạnh mục tiêu trong tập Gold Eval nhằm làm rõ khả năng nhận diện ngữ nghĩa cụ thể của từng thuật toán.</w:t>
       </w:r>
     </w:p>
     <w:p>
@@ -48284,54 +47044,9 @@
           <w:lang w:val="vi-VN"/>
         </w:rPr>
       </w:pPr>
-      <w:bookmarkStart w:id="68" w:name="_Toc233743582"/>
-      <w:r>
-        <w:rPr>
-          <w:b/>
-          <w:sz w:val="22"/>
-          <w:lang w:val="vi-VN"/>
-        </w:rPr>
-        <w:t xml:space="preserve">Bảng </w:t>
-      </w:r>
-      <w:r>
-        <w:rPr>
-          <w:lang w:val="vi-VN"/>
-        </w:rPr>
-        <w:fldChar w:fldCharType="begin"/>
-      </w:r>
-      <w:r>
-        <w:rPr>
-          <w:lang w:val="vi-VN"/>
-        </w:rPr>
-        <w:instrText>SEQ Bảng \* ARABIC</w:instrText>
-      </w:r>
-      <w:r>
-        <w:rPr>
-          <w:lang w:val="vi-VN"/>
-        </w:rPr>
-        <w:fldChar w:fldCharType="separate"/>
-      </w:r>
-      <w:r>
-        <w:rPr>
-          <w:noProof/>
-          <w:lang w:val="vi-VN"/>
-        </w:rPr>
-        <w:t>7</w:t>
-      </w:r>
-      <w:r>
-        <w:rPr>
-          <w:lang w:val="vi-VN"/>
-        </w:rPr>
-        <w:fldChar w:fldCharType="end"/>
-      </w:r>
-      <w:r>
-        <w:rPr>
-          <w:sz w:val="22"/>
-          <w:lang w:val="vi-VN"/>
-        </w:rPr>
-        <w:t>: So sánh chi tiết hiệu năng Aspect-specific F1-score</w:t>
-      </w:r>
-      <w:bookmarkEnd w:id="68"/>
+      <w:r>
+        <w:t>Bảng 4.2: So sánh chi tiết hiệu năng Aspect-specific F1-score</w:t>
+      </w:r>
     </w:p>
     <w:p>
       <w:pPr>
@@ -49939,7 +48654,7 @@
         <w:rPr>
           <w:lang w:val="vi-VN"/>
         </w:rPr>
-        <w:t xml:space="preserve"> (Nguyen và cộng sự, 2018). Tuy nhiên, đề tài đã phát triển và cải tiến vượt bậc nhằm giải quyết bài toán thực tế của doanh nghiệp TMĐT. Bảng 8 đối chiếu chi tiết sự khác biệt học thuật và thực tiễn giữa nghiên cứu gốc và đề tài.</w:t>
+        <w:t xml:space="preserve"> (Nguyen và cộng sự, 2018). Tuy nhiên, đề tài đã phát triển và cải tiến vượt bậc nhằm giải quyết bài toán thực tế của doanh nghiệp TMĐT. Bảng 4.3 đối chiếu chi tiết sự khác biệt học thuật và thực tiễn giữa nghiên cứu gốc và đề tài.</w:t>
       </w:r>
     </w:p>
     <w:p>
@@ -49950,54 +48665,9 @@
           <w:lang w:val="vi-VN"/>
         </w:rPr>
       </w:pPr>
-      <w:bookmarkStart w:id="74" w:name="_Toc233743583"/>
-      <w:r>
-        <w:rPr>
-          <w:b/>
-          <w:sz w:val="22"/>
-          <w:lang w:val="vi-VN"/>
-        </w:rPr>
-        <w:t xml:space="preserve">Bảng </w:t>
-      </w:r>
-      <w:r>
-        <w:rPr>
-          <w:lang w:val="vi-VN"/>
-        </w:rPr>
-        <w:fldChar w:fldCharType="begin"/>
-      </w:r>
-      <w:r>
-        <w:rPr>
-          <w:lang w:val="vi-VN"/>
-        </w:rPr>
-        <w:instrText>SEQ Bảng \* ARABIC</w:instrText>
-      </w:r>
-      <w:r>
-        <w:rPr>
-          <w:lang w:val="vi-VN"/>
-        </w:rPr>
-        <w:fldChar w:fldCharType="separate"/>
-      </w:r>
-      <w:r>
-        <w:rPr>
-          <w:noProof/>
-          <w:lang w:val="vi-VN"/>
-        </w:rPr>
-        <w:t>8</w:t>
-      </w:r>
-      <w:r>
-        <w:rPr>
-          <w:lang w:val="vi-VN"/>
-        </w:rPr>
-        <w:fldChar w:fldCharType="end"/>
-      </w:r>
-      <w:r>
-        <w:rPr>
-          <w:sz w:val="22"/>
-          <w:lang w:val="vi-VN"/>
-        </w:rPr>
-        <w:t>: So sánh đối chiếu học thuật giữa bài báo gốc UIT-VSFC và đề tài khóa luận</w:t>
-      </w:r>
-      <w:bookmarkEnd w:id="74"/>
+      <w:r>
+        <w:t>Bảng 4.3: So sánh đối chiếu học thuật giữa bài báo gốc UIT-VSFC và đề tài khóa luận</w:t>
+      </w:r>
     </w:p>
     <w:p>
       <w:pPr>
@@ -52455,54 +51125,9 @@
           <w:lang w:val="vi-VN"/>
         </w:rPr>
       </w:pPr>
-      <w:bookmarkStart w:id="81" w:name="_Toc233743584"/>
-      <w:r>
-        <w:rPr>
-          <w:b/>
-          <w:sz w:val="22"/>
-          <w:lang w:val="vi-VN"/>
-        </w:rPr>
-        <w:t xml:space="preserve">Bảng </w:t>
-      </w:r>
-      <w:r>
-        <w:rPr>
-          <w:lang w:val="vi-VN"/>
-        </w:rPr>
-        <w:fldChar w:fldCharType="begin"/>
-      </w:r>
-      <w:r>
-        <w:rPr>
-          <w:lang w:val="vi-VN"/>
-        </w:rPr>
-        <w:instrText>SEQ Bảng \* ARABIC</w:instrText>
-      </w:r>
-      <w:r>
-        <w:rPr>
-          <w:lang w:val="vi-VN"/>
-        </w:rPr>
-        <w:fldChar w:fldCharType="separate"/>
-      </w:r>
-      <w:r>
-        <w:rPr>
-          <w:noProof/>
-          <w:lang w:val="vi-VN"/>
-        </w:rPr>
-        <w:t>9</w:t>
-      </w:r>
-      <w:r>
-        <w:rPr>
-          <w:lang w:val="vi-VN"/>
-        </w:rPr>
-        <w:fldChar w:fldCharType="end"/>
-      </w:r>
-      <w:r>
-        <w:rPr>
-          <w:sz w:val="22"/>
-          <w:lang w:val="vi-VN"/>
-        </w:rPr>
-        <w:t>: Hệ thống giải pháp tối ưu hóa kinh doanh theo khung RACE</w:t>
-      </w:r>
-      <w:bookmarkEnd w:id="81"/>
+      <w:r>
+        <w:t>Bảng 4.4: Hệ thống giải pháp tối ưu hóa kinh doanh theo khung RACE</w:t>
+      </w:r>
     </w:p>
     <w:p>
       <w:pPr>

</xml_diff>